<commit_message>
membuat program total tiket bioskop
</commit_message>
<xml_diff>
--- a/Jobsheet 7.docx
+++ b/Jobsheet 7.docx
@@ -43,6 +43,7 @@
       <w:pPr>
         <w:pStyle w:val="30"/>
         <w:numPr>
+          <w:ilvl w:val="0"/>
           <w:numId w:val="0"/>
         </w:numPr>
         <w:spacing w:after="0" w:line="276" w:lineRule="auto"/>
@@ -119,6 +120,7 @@
       <w:pPr>
         <w:pStyle w:val="30"/>
         <w:numPr>
+          <w:ilvl w:val="0"/>
           <w:numId w:val="0"/>
         </w:numPr>
         <w:spacing w:after="0" w:line="276" w:lineRule="auto"/>
@@ -145,6 +147,7 @@
       <w:pPr>
         <w:pStyle w:val="30"/>
         <w:numPr>
+          <w:ilvl w:val="0"/>
           <w:numId w:val="0"/>
         </w:numPr>
         <w:spacing w:after="0" w:line="276" w:lineRule="auto"/>
@@ -170,6 +173,7 @@
       <w:pPr>
         <w:pStyle w:val="30"/>
         <w:numPr>
+          <w:ilvl w:val="0"/>
           <w:numId w:val="0"/>
         </w:numPr>
         <w:spacing w:after="0" w:line="276" w:lineRule="auto"/>
@@ -205,6 +209,7 @@
       <w:pPr>
         <w:pStyle w:val="30"/>
         <w:numPr>
+          <w:ilvl w:val="0"/>
           <w:numId w:val="0"/>
         </w:numPr>
         <w:spacing w:after="0" w:line="276" w:lineRule="auto"/>
@@ -227,6 +232,7 @@
       <w:pPr>
         <w:pStyle w:val="30"/>
         <w:numPr>
+          <w:ilvl w:val="0"/>
           <w:numId w:val="0"/>
         </w:numPr>
         <w:spacing w:after="0" w:line="276" w:lineRule="auto"/>
@@ -249,6 +255,7 @@
       <w:pPr>
         <w:pStyle w:val="30"/>
         <w:numPr>
+          <w:ilvl w:val="0"/>
           <w:numId w:val="0"/>
         </w:numPr>
         <w:spacing w:after="0" w:line="276" w:lineRule="auto"/>
@@ -283,6 +290,7 @@
       <w:pPr>
         <w:pStyle w:val="30"/>
         <w:numPr>
+          <w:ilvl w:val="0"/>
           <w:numId w:val="0"/>
         </w:numPr>
         <w:spacing w:after="0" w:line="276" w:lineRule="auto"/>
@@ -335,6 +343,7 @@
       <w:pPr>
         <w:pStyle w:val="30"/>
         <w:numPr>
+          <w:ilvl w:val="0"/>
           <w:numId w:val="0"/>
         </w:numPr>
         <w:spacing w:after="0" w:line="276" w:lineRule="auto"/>
@@ -356,6 +365,7 @@
       <w:pPr>
         <w:pStyle w:val="30"/>
         <w:numPr>
+          <w:ilvl w:val="0"/>
           <w:numId w:val="0"/>
         </w:numPr>
         <w:spacing w:after="0" w:line="276" w:lineRule="auto"/>
@@ -390,6 +400,7 @@
       <w:pPr>
         <w:pStyle w:val="30"/>
         <w:numPr>
+          <w:ilvl w:val="0"/>
           <w:numId w:val="0"/>
         </w:numPr>
         <w:spacing w:after="0" w:line="276" w:lineRule="auto"/>
@@ -442,6 +453,7 @@
       <w:pPr>
         <w:pStyle w:val="30"/>
         <w:numPr>
+          <w:ilvl w:val="0"/>
           <w:numId w:val="0"/>
         </w:numPr>
         <w:spacing w:after="0" w:line="276" w:lineRule="auto"/>
@@ -519,6 +531,7 @@
     <w:p>
       <w:pPr>
         <w:numPr>
+          <w:ilvl w:val="0"/>
           <w:numId w:val="0"/>
         </w:numPr>
         <w:spacing w:after="0" w:line="276" w:lineRule="auto"/>
@@ -566,6 +579,7 @@
     <w:p>
       <w:pPr>
         <w:numPr>
+          <w:ilvl w:val="0"/>
           <w:numId w:val="0"/>
         </w:numPr>
         <w:spacing w:after="0" w:line="276" w:lineRule="auto"/>
@@ -590,6 +604,7 @@
     <w:p>
       <w:pPr>
         <w:numPr>
+          <w:ilvl w:val="0"/>
           <w:numId w:val="0"/>
         </w:numPr>
         <w:spacing w:after="0" w:line="276" w:lineRule="auto"/>
@@ -625,6 +640,7 @@
     <w:p>
       <w:pPr>
         <w:numPr>
+          <w:ilvl w:val="0"/>
           <w:numId w:val="0"/>
         </w:numPr>
         <w:spacing w:after="0" w:line="276" w:lineRule="auto"/>
@@ -649,6 +665,7 @@
     <w:p>
       <w:pPr>
         <w:numPr>
+          <w:ilvl w:val="0"/>
           <w:numId w:val="0"/>
         </w:numPr>
         <w:spacing w:after="0" w:line="276" w:lineRule="auto"/>
@@ -673,6 +690,7 @@
     <w:p>
       <w:pPr>
         <w:numPr>
+          <w:ilvl w:val="0"/>
           <w:numId w:val="0"/>
         </w:numPr>
         <w:spacing w:after="0" w:line="276" w:lineRule="auto"/>
@@ -681,131 +699,577 @@
           <w:sz w:val="24"/>
           <w:szCs w:val="24"/>
           <w:lang w:val="en-US"/>
+        </w:rPr>
+      </w:pPr>
+    </w:p>
+    <w:p>
+      <w:pPr>
+        <w:numPr>
+          <w:ilvl w:val="0"/>
+          <w:numId w:val="2"/>
+        </w:numPr>
+        <w:spacing w:after="0" w:line="276" w:lineRule="auto"/>
+        <w:rPr>
+          <w:rFonts w:hint="default" w:ascii="Times New Roman" w:hAnsi="Times New Roman" w:cs="Times New Roman"/>
+          <w:lang w:val="en-US"/>
+        </w:rPr>
+      </w:pPr>
+      <w:r>
+        <w:rPr>
+          <w:rFonts w:hint="default" w:ascii="Times New Roman" w:hAnsi="Times New Roman" w:eastAsia="SimSun" w:cs="Times New Roman"/>
+          <w:sz w:val="24"/>
+          <w:szCs w:val="24"/>
+        </w:rPr>
+        <w:t xml:space="preserve">Apabila jumlah mahasiswa yang dimasukkan adalah 19, berapa kali perulangan WHILE akan berjalan? </w:t>
+      </w:r>
+    </w:p>
+    <w:p>
+      <w:pPr>
+        <w:numPr>
+          <w:ilvl w:val="0"/>
+          <w:numId w:val="0"/>
+        </w:numPr>
+        <w:spacing w:after="0" w:line="276" w:lineRule="auto"/>
+        <w:rPr>
+          <w:rFonts w:hint="default" w:ascii="Times New Roman" w:hAnsi="Times New Roman" w:eastAsia="SimSun" w:cs="Times New Roman"/>
+          <w:sz w:val="24"/>
+          <w:szCs w:val="24"/>
+          <w:lang w:val="en-US"/>
+        </w:rPr>
+      </w:pPr>
+      <w:r>
+        <w:rPr>
+          <w:rFonts w:hint="default" w:ascii="Times New Roman" w:hAnsi="Times New Roman" w:eastAsia="SimSun" w:cs="Times New Roman"/>
+          <w:sz w:val="24"/>
+          <w:szCs w:val="24"/>
+        </w:rPr>
+        <w:t xml:space="preserve"> </w:t>
+      </w:r>
+      <w:r>
+        <w:rPr>
+          <w:rFonts w:hint="default" w:ascii="Times New Roman" w:hAnsi="Times New Roman" w:eastAsia="SimSun" w:cs="Times New Roman"/>
+          <w:sz w:val="24"/>
+          <w:szCs w:val="24"/>
+          <w:lang w:val="en-US"/>
+        </w:rPr>
+        <w:t xml:space="preserve">- maka akan terjadi 19 pengulangan </w:t>
+      </w:r>
+    </w:p>
+    <w:p>
+      <w:pPr>
+        <w:numPr>
+          <w:ilvl w:val="0"/>
+          <w:numId w:val="0"/>
+        </w:numPr>
+        <w:spacing w:after="0" w:line="276" w:lineRule="auto"/>
+        <w:rPr>
+          <w:rFonts w:hint="default" w:ascii="Times New Roman" w:hAnsi="Times New Roman" w:eastAsia="SimSun" w:cs="Times New Roman"/>
+          <w:sz w:val="24"/>
+          <w:szCs w:val="24"/>
+          <w:lang w:val="en-US"/>
+        </w:rPr>
+      </w:pPr>
+    </w:p>
+    <w:p>
+      <w:pPr>
+        <w:numPr>
+          <w:ilvl w:val="0"/>
+          <w:numId w:val="2"/>
+        </w:numPr>
+        <w:spacing w:after="0" w:line="276" w:lineRule="auto"/>
+        <w:rPr>
+          <w:rFonts w:hint="default" w:ascii="Times New Roman" w:hAnsi="Times New Roman" w:cs="Times New Roman"/>
+          <w:lang w:val="en-US"/>
+        </w:rPr>
+      </w:pPr>
+      <w:r>
+        <w:rPr>
+          <w:rFonts w:hint="default" w:ascii="Times New Roman" w:hAnsi="Times New Roman" w:eastAsia="SimSun" w:cs="Times New Roman"/>
+          <w:sz w:val="24"/>
+          <w:szCs w:val="24"/>
+        </w:rPr>
+        <w:t>Modifikasi kode program sehingga apabila terdapat mahasiswa yang mendapat nilai A, program menampilkan pesan tambahan "Bagus, pertahankan nilainya"!</w:t>
+      </w:r>
+    </w:p>
+    <w:p>
+      <w:pPr>
+        <w:numPr>
+          <w:ilvl w:val="0"/>
+          <w:numId w:val="0"/>
+        </w:numPr>
+        <w:spacing w:after="0" w:line="276" w:lineRule="auto"/>
+      </w:pPr>
+      <w:r>
+        <w:rPr>
+          <w:rFonts w:hint="default" w:ascii="Times New Roman" w:hAnsi="Times New Roman" w:eastAsia="SimSun" w:cs="Times New Roman"/>
+          <w:sz w:val="24"/>
+          <w:szCs w:val="24"/>
+          <w:lang w:val="en-US"/>
+        </w:rPr>
+        <w:t xml:space="preserve">-  </w:t>
+      </w:r>
+      <w:r>
+        <w:drawing>
+          <wp:inline distT="0" distB="0" distL="114300" distR="114300">
+            <wp:extent cx="5727065" cy="1200785"/>
+            <wp:effectExtent l="0" t="0" r="3175" b="3175"/>
+            <wp:docPr id="4" name="Picture 1"/>
+            <wp:cNvGraphicFramePr>
+              <a:graphicFrameLocks xmlns:a="http://schemas.openxmlformats.org/drawingml/2006/main" noChangeAspect="1"/>
+            </wp:cNvGraphicFramePr>
+            <a:graphic xmlns:a="http://schemas.openxmlformats.org/drawingml/2006/main">
+              <a:graphicData uri="http://schemas.openxmlformats.org/drawingml/2006/picture">
+                <pic:pic xmlns:pic="http://schemas.openxmlformats.org/drawingml/2006/picture">
+                  <pic:nvPicPr>
+                    <pic:cNvPr id="4" name="Picture 1"/>
+                    <pic:cNvPicPr>
+                      <a:picLocks noChangeAspect="1"/>
+                    </pic:cNvPicPr>
+                  </pic:nvPicPr>
+                  <pic:blipFill>
+                    <a:blip r:embed="rId11"/>
+                    <a:stretch>
+                      <a:fillRect/>
+                    </a:stretch>
+                  </pic:blipFill>
+                  <pic:spPr>
+                    <a:xfrm>
+                      <a:off x="0" y="0"/>
+                      <a:ext cx="5727065" cy="1200785"/>
+                    </a:xfrm>
+                    <a:prstGeom prst="rect">
+                      <a:avLst/>
+                    </a:prstGeom>
+                    <a:noFill/>
+                    <a:ln>
+                      <a:noFill/>
+                    </a:ln>
+                  </pic:spPr>
+                </pic:pic>
+              </a:graphicData>
+            </a:graphic>
+          </wp:inline>
+        </w:drawing>
+      </w:r>
+    </w:p>
+    <w:p>
+      <w:pPr>
+        <w:numPr>
+          <w:ilvl w:val="0"/>
+          <w:numId w:val="0"/>
+        </w:numPr>
+        <w:spacing w:after="0" w:line="276" w:lineRule="auto"/>
+      </w:pPr>
+    </w:p>
+    <w:p>
+      <w:pPr>
+        <w:numPr>
+          <w:ilvl w:val="0"/>
+          <w:numId w:val="0"/>
+        </w:numPr>
+        <w:spacing w:after="0" w:line="276" w:lineRule="auto"/>
+        <w:rPr>
+          <w:rFonts w:hint="default"/>
+          <w:lang w:val="en-US"/>
+        </w:rPr>
+      </w:pPr>
+      <w:r>
+        <w:rPr>
+          <w:rFonts w:hint="default"/>
+          <w:lang w:val="en-US"/>
+        </w:rPr>
+        <w:t>Percobaan 3</w:t>
+      </w:r>
+    </w:p>
+    <w:p>
+      <w:pPr>
+        <w:keepNext w:val="0"/>
+        <w:keepLines w:val="0"/>
+        <w:widowControl/>
+        <w:numPr>
+          <w:ilvl w:val="0"/>
+          <w:numId w:val="4"/>
+        </w:numPr>
+        <w:suppressLineNumbers w:val="0"/>
+        <w:jc w:val="left"/>
+      </w:pPr>
+      <w:r>
+        <w:rPr>
+          <w:rFonts w:ascii="Calibri" w:hAnsi="Calibri" w:eastAsia="SimSun" w:cs="Calibri"/>
+          <w:color w:val="000000"/>
+          <w:kern w:val="0"/>
+          <w:sz w:val="24"/>
+          <w:szCs w:val="24"/>
+          <w:lang w:val="en-US" w:eastAsia="zh-CN" w:bidi="ar"/>
+          <w14:ligatures w14:val="standardContextual"/>
+        </w:rPr>
+        <w:t xml:space="preserve">Pada penggunaan DO-WHILE ini, apabila nama pelanggan yang dimasukkan pertama kali </w:t>
+      </w:r>
+    </w:p>
+    <w:p>
+      <w:pPr>
+        <w:keepNext w:val="0"/>
+        <w:keepLines w:val="0"/>
+        <w:widowControl/>
+        <w:suppressLineNumbers w:val="0"/>
+        <w:jc w:val="left"/>
+        <w:rPr>
+          <w:rFonts w:hint="default" w:ascii="Calibri" w:hAnsi="Calibri" w:eastAsia="SimSun" w:cs="Calibri"/>
+          <w:color w:val="000000"/>
+          <w:kern w:val="0"/>
+          <w:sz w:val="24"/>
+          <w:szCs w:val="24"/>
+          <w:lang w:val="en-US" w:eastAsia="zh-CN" w:bidi="ar"/>
+          <w14:ligatures w14:val="standardContextual"/>
+        </w:rPr>
+      </w:pPr>
+      <w:r>
+        <w:rPr>
+          <w:rFonts w:hint="default" w:ascii="Calibri" w:hAnsi="Calibri" w:eastAsia="SimSun" w:cs="Calibri"/>
+          <w:color w:val="000000"/>
+          <w:kern w:val="0"/>
+          <w:sz w:val="24"/>
+          <w:szCs w:val="24"/>
+          <w:lang w:val="en-US" w:eastAsia="zh-CN" w:bidi="ar"/>
+          <w14:ligatures w14:val="standardContextual"/>
+        </w:rPr>
+        <w:t xml:space="preserve">adalah “batal”, maka berapa kali perulangan dilakukan? </w:t>
+      </w:r>
+    </w:p>
+    <w:p>
+      <w:pPr>
+        <w:keepNext w:val="0"/>
+        <w:keepLines w:val="0"/>
+        <w:widowControl/>
+        <w:suppressLineNumbers w:val="0"/>
+        <w:jc w:val="left"/>
+        <w:rPr>
+          <w:rFonts w:hint="default" w:ascii="Calibri" w:hAnsi="Calibri" w:eastAsia="SimSun" w:cs="Calibri"/>
+          <w:color w:val="000000"/>
+          <w:kern w:val="0"/>
+          <w:sz w:val="24"/>
+          <w:szCs w:val="24"/>
+          <w:lang w:val="en-US" w:eastAsia="zh-CN" w:bidi="ar"/>
+          <w14:ligatures w14:val="standardContextual"/>
+        </w:rPr>
+      </w:pPr>
+      <w:r>
+        <w:rPr>
+          <w:rFonts w:hint="default" w:ascii="Calibri" w:hAnsi="Calibri" w:eastAsia="SimSun" w:cs="Calibri"/>
+          <w:color w:val="000000"/>
+          <w:kern w:val="0"/>
+          <w:sz w:val="24"/>
+          <w:szCs w:val="24"/>
+          <w:lang w:val="en-US" w:eastAsia="zh-CN" w:bidi="ar"/>
+          <w14:ligatures w14:val="standardContextual"/>
+        </w:rPr>
+        <w:t>- dihitungnya sekali perulangan karena ketika menginputkan batal maka langsung break atau proses tidak akan dilanjutkan</w:t>
+      </w:r>
+    </w:p>
+    <w:p>
+      <w:pPr>
+        <w:keepNext w:val="0"/>
+        <w:keepLines w:val="0"/>
+        <w:widowControl/>
+        <w:suppressLineNumbers w:val="0"/>
+        <w:jc w:val="left"/>
+        <w:rPr>
+          <w:rFonts w:hint="default" w:ascii="Calibri" w:hAnsi="Calibri" w:eastAsia="SimSun" w:cs="Calibri"/>
+          <w:color w:val="000000"/>
+          <w:kern w:val="0"/>
+          <w:sz w:val="24"/>
+          <w:szCs w:val="24"/>
+          <w:lang w:val="en-US" w:eastAsia="zh-CN" w:bidi="ar"/>
+          <w14:ligatures w14:val="standardContextual"/>
+        </w:rPr>
+      </w:pPr>
+    </w:p>
+    <w:p>
+      <w:pPr>
+        <w:keepNext w:val="0"/>
+        <w:keepLines w:val="0"/>
+        <w:widowControl/>
+        <w:numPr>
+          <w:ilvl w:val="0"/>
+          <w:numId w:val="4"/>
+        </w:numPr>
+        <w:suppressLineNumbers w:val="0"/>
+        <w:ind w:left="0" w:leftChars="0" w:firstLine="0" w:firstLineChars="0"/>
+        <w:jc w:val="left"/>
+        <w:rPr>
+          <w:rFonts w:hint="default" w:ascii="Calibri" w:hAnsi="Calibri" w:eastAsia="SimSun" w:cs="Calibri"/>
+          <w:color w:val="000000"/>
+          <w:kern w:val="0"/>
+          <w:sz w:val="24"/>
+          <w:szCs w:val="24"/>
+          <w:lang w:val="en-US" w:eastAsia="zh-CN" w:bidi="ar"/>
+          <w14:ligatures w14:val="standardContextual"/>
+        </w:rPr>
+      </w:pPr>
+      <w:r>
+        <w:rPr>
+          <w:rFonts w:hint="default" w:ascii="Calibri" w:hAnsi="Calibri" w:eastAsia="SimSun" w:cs="Calibri"/>
+          <w:color w:val="000000"/>
+          <w:kern w:val="0"/>
+          <w:sz w:val="24"/>
+          <w:szCs w:val="24"/>
+          <w:lang w:val="en-US" w:eastAsia="zh-CN" w:bidi="ar"/>
+          <w14:ligatures w14:val="standardContextual"/>
+        </w:rPr>
+        <w:t xml:space="preserve">Sebutkan kondisi berhenti yang digunakan pada perulangan DO-WHILE tersebut! </w:t>
+      </w:r>
+    </w:p>
+    <w:p>
+      <w:pPr>
+        <w:keepNext w:val="0"/>
+        <w:keepLines w:val="0"/>
+        <w:widowControl/>
+        <w:numPr>
+          <w:numId w:val="0"/>
+        </w:numPr>
+        <w:suppressLineNumbers w:val="0"/>
+        <w:ind w:leftChars="0"/>
+        <w:jc w:val="left"/>
+        <w:rPr>
+          <w:rFonts w:hint="default" w:ascii="Calibri" w:hAnsi="Calibri" w:eastAsia="SimSun" w:cs="Calibri"/>
+          <w:color w:val="000000"/>
+          <w:kern w:val="0"/>
+          <w:sz w:val="24"/>
+          <w:szCs w:val="24"/>
+          <w:lang w:val="en-US" w:eastAsia="zh-CN" w:bidi="ar"/>
+          <w14:ligatures w14:val="standardContextual"/>
+        </w:rPr>
+      </w:pPr>
+      <w:r>
+        <w:rPr>
+          <w:rFonts w:hint="default" w:ascii="Calibri" w:hAnsi="Calibri" w:eastAsia="SimSun" w:cs="Calibri"/>
+          <w:color w:val="000000"/>
+          <w:kern w:val="0"/>
+          <w:sz w:val="24"/>
+          <w:szCs w:val="24"/>
+          <w:lang w:val="en-US" w:eastAsia="zh-CN" w:bidi="ar"/>
+          <w14:ligatures w14:val="standardContextual"/>
+        </w:rPr>
+        <w:t>- break , digunakan untuk menghentikan program secara paksa</w:t>
+      </w:r>
+    </w:p>
+    <w:p>
+      <w:pPr>
+        <w:keepNext w:val="0"/>
+        <w:keepLines w:val="0"/>
+        <w:widowControl/>
+        <w:numPr>
+          <w:numId w:val="0"/>
+        </w:numPr>
+        <w:suppressLineNumbers w:val="0"/>
+        <w:ind w:leftChars="0"/>
+        <w:jc w:val="left"/>
+        <w:rPr>
+          <w:rFonts w:hint="default" w:ascii="Calibri" w:hAnsi="Calibri" w:eastAsia="SimSun" w:cs="Calibri"/>
+          <w:color w:val="000000"/>
+          <w:kern w:val="0"/>
+          <w:sz w:val="24"/>
+          <w:szCs w:val="24"/>
+          <w:lang w:val="en-US" w:eastAsia="zh-CN" w:bidi="ar"/>
+          <w14:ligatures w14:val="standardContextual"/>
+        </w:rPr>
+      </w:pPr>
+    </w:p>
+    <w:p>
+      <w:pPr>
+        <w:keepNext w:val="0"/>
+        <w:keepLines w:val="0"/>
+        <w:widowControl/>
+        <w:suppressLineNumbers w:val="0"/>
+        <w:jc w:val="left"/>
+        <w:rPr>
+          <w:rFonts w:hint="default" w:ascii="Calibri" w:hAnsi="Calibri" w:eastAsia="SimSun" w:cs="Calibri"/>
+          <w:color w:val="000000"/>
+          <w:kern w:val="0"/>
+          <w:sz w:val="24"/>
+          <w:szCs w:val="24"/>
+          <w:lang w:val="en-US" w:eastAsia="zh-CN" w:bidi="ar"/>
+          <w14:ligatures w14:val="standardContextual"/>
+        </w:rPr>
+      </w:pPr>
+      <w:r>
+        <w:rPr>
+          <w:rFonts w:hint="default" w:ascii="Calibri" w:hAnsi="Calibri" w:eastAsia="SimSun" w:cs="Calibri"/>
+          <w:color w:val="000000"/>
+          <w:kern w:val="0"/>
+          <w:sz w:val="24"/>
+          <w:szCs w:val="24"/>
+          <w:lang w:val="en-US" w:eastAsia="zh-CN" w:bidi="ar"/>
+          <w14:ligatures w14:val="standardContextual"/>
+        </w:rPr>
+        <w:t xml:space="preserve">3. Apa fungsi dari penggunaan nilai </w:t>
+      </w:r>
+      <w:r>
+        <w:rPr>
+          <w:rFonts w:ascii="Calibri-Bold" w:hAnsi="Calibri-Bold" w:eastAsia="Calibri-Bold" w:cs="Calibri-Bold"/>
+          <w:b/>
+          <w:bCs/>
+          <w:color w:val="000000"/>
+          <w:kern w:val="0"/>
+          <w:sz w:val="24"/>
+          <w:szCs w:val="24"/>
+          <w:lang w:val="en-US" w:eastAsia="zh-CN" w:bidi="ar"/>
+          <w14:ligatures w14:val="standardContextual"/>
+        </w:rPr>
+        <w:t xml:space="preserve">true </w:t>
+      </w:r>
+      <w:r>
+        <w:rPr>
+          <w:rFonts w:hint="default" w:ascii="Calibri" w:hAnsi="Calibri" w:eastAsia="SimSun" w:cs="Calibri"/>
+          <w:color w:val="000000"/>
+          <w:kern w:val="0"/>
+          <w:sz w:val="24"/>
+          <w:szCs w:val="24"/>
+          <w:lang w:val="en-US" w:eastAsia="zh-CN" w:bidi="ar"/>
+          <w14:ligatures w14:val="standardContextual"/>
+        </w:rPr>
+        <w:t xml:space="preserve">pada kondisi DO-WHILE? </w:t>
+      </w:r>
+    </w:p>
+    <w:p>
+      <w:pPr>
+        <w:keepNext w:val="0"/>
+        <w:keepLines w:val="0"/>
+        <w:widowControl/>
+        <w:suppressLineNumbers w:val="0"/>
+        <w:jc w:val="left"/>
+        <w:rPr>
+          <w:rFonts w:hint="default" w:ascii="Calibri" w:hAnsi="Calibri" w:eastAsia="SimSun" w:cs="Calibri"/>
+          <w:color w:val="000000"/>
+          <w:kern w:val="0"/>
+          <w:sz w:val="24"/>
+          <w:szCs w:val="24"/>
+          <w:lang w:val="en-US" w:eastAsia="zh-CN" w:bidi="ar"/>
+          <w14:ligatures w14:val="standardContextual"/>
+        </w:rPr>
+      </w:pPr>
+      <w:r>
+        <w:rPr>
+          <w:rFonts w:hint="default" w:ascii="Calibri" w:hAnsi="Calibri" w:eastAsia="SimSun" w:cs="Calibri"/>
+          <w:color w:val="000000"/>
+          <w:kern w:val="0"/>
+          <w:sz w:val="24"/>
+          <w:szCs w:val="24"/>
+          <w:lang w:val="en-US" w:eastAsia="zh-CN" w:bidi="ar"/>
+          <w14:ligatures w14:val="standardContextual"/>
+        </w:rPr>
+        <w:t>- nilai true digunakan untuk membuat perulangan terus menerus , jika nilai nya false maka program akan langsung berhenti</w:t>
+      </w:r>
+    </w:p>
+    <w:p>
+      <w:pPr>
+        <w:keepNext w:val="0"/>
+        <w:keepLines w:val="0"/>
+        <w:widowControl/>
+        <w:suppressLineNumbers w:val="0"/>
+        <w:jc w:val="left"/>
+      </w:pPr>
+      <w:r>
+        <w:rPr>
+          <w:rFonts w:hint="default" w:ascii="Calibri" w:hAnsi="Calibri" w:eastAsia="SimSun" w:cs="Calibri"/>
+          <w:color w:val="000000"/>
+          <w:kern w:val="0"/>
+          <w:sz w:val="24"/>
+          <w:szCs w:val="24"/>
+          <w:lang w:val="en-US" w:eastAsia="zh-CN" w:bidi="ar"/>
+          <w14:ligatures w14:val="standardContextual"/>
+        </w:rPr>
+        <w:t xml:space="preserve">4. Mengapa perulangan DO-WHILE tersebut tetap berjalan meskipun tidak ada komponen </w:t>
+      </w:r>
+    </w:p>
+    <w:p>
+      <w:pPr>
+        <w:keepNext w:val="0"/>
+        <w:keepLines w:val="0"/>
+        <w:widowControl/>
+        <w:suppressLineNumbers w:val="0"/>
+        <w:jc w:val="left"/>
+        <w:rPr>
+          <w:rFonts w:hint="default" w:ascii="Calibri" w:hAnsi="Calibri" w:eastAsia="SimSun" w:cs="Calibri"/>
+          <w:color w:val="000000"/>
+          <w:kern w:val="0"/>
+          <w:sz w:val="24"/>
+          <w:szCs w:val="24"/>
+          <w:lang w:val="en-US" w:eastAsia="zh-CN" w:bidi="ar"/>
+          <w14:ligatures w14:val="standardContextual"/>
+        </w:rPr>
+      </w:pPr>
+      <w:r>
+        <w:rPr>
+          <w:rFonts w:hint="default" w:ascii="Calibri" w:hAnsi="Calibri" w:eastAsia="SimSun" w:cs="Calibri"/>
+          <w:color w:val="000000"/>
+          <w:kern w:val="0"/>
+          <w:sz w:val="24"/>
+          <w:szCs w:val="24"/>
+          <w:lang w:val="en-US" w:eastAsia="zh-CN" w:bidi="ar"/>
+          <w14:ligatures w14:val="standardContextual"/>
+        </w:rPr>
+        <w:t>inisialisasi dan update?</w:t>
+      </w:r>
+    </w:p>
+    <w:p>
+      <w:pPr>
+        <w:keepNext w:val="0"/>
+        <w:keepLines w:val="0"/>
+        <w:widowControl/>
+        <w:suppressLineNumbers w:val="0"/>
+        <w:jc w:val="left"/>
+        <w:rPr>
+          <w:rFonts w:hint="default" w:ascii="Calibri" w:hAnsi="Calibri" w:eastAsia="SimSun" w:cs="Calibri"/>
+          <w:color w:val="000000"/>
+          <w:kern w:val="0"/>
+          <w:sz w:val="24"/>
+          <w:szCs w:val="24"/>
+          <w:lang w:val="en-US" w:eastAsia="zh-CN" w:bidi="ar"/>
+          <w14:ligatures w14:val="standardContextual"/>
+        </w:rPr>
+      </w:pPr>
+      <w:r>
+        <w:rPr>
+          <w:rFonts w:hint="default" w:ascii="Calibri" w:hAnsi="Calibri" w:eastAsia="SimSun" w:cs="Calibri"/>
+          <w:color w:val="000000"/>
+          <w:kern w:val="0"/>
+          <w:sz w:val="24"/>
+          <w:szCs w:val="24"/>
+          <w:lang w:val="en-US" w:eastAsia="zh-CN" w:bidi="ar"/>
+          <w14:ligatures w14:val="standardContextual"/>
+        </w:rPr>
+        <w:t xml:space="preserve">-  karena do while melakukan perulangan hanya dari nilai kondisi nya (true/false) jadi tidak peduli kalaupun nilai variabel nya diubah ubah </w:t>
+      </w:r>
+    </w:p>
+    <w:p>
+      <w:pPr>
+        <w:numPr>
+          <w:ilvl w:val="0"/>
+          <w:numId w:val="0"/>
+        </w:numPr>
+        <w:spacing w:after="0" w:line="276" w:lineRule="auto"/>
+        <w:rPr>
+          <w:rFonts w:hint="default"/>
+          <w:lang w:val="en-US"/>
+        </w:rPr>
+      </w:pPr>
+    </w:p>
+    <w:p>
+      <w:pPr>
+        <w:pStyle w:val="30"/>
+        <w:numPr>
+          <w:ilvl w:val="0"/>
+          <w:numId w:val="0"/>
+        </w:numPr>
+        <w:spacing w:after="0" w:line="276" w:lineRule="auto"/>
+        <w:contextualSpacing/>
+        <w:rPr>
+          <w:rFonts w:hint="default" w:ascii="Times New Roman" w:hAnsi="Times New Roman" w:cs="Times New Roman"/>
         </w:rPr>
       </w:pPr>
       <w:bookmarkStart w:id="0" w:name="_GoBack"/>
       <w:bookmarkEnd w:id="0"/>
-    </w:p>
-    <w:p>
-      <w:pPr>
-        <w:numPr>
-          <w:ilvl w:val="0"/>
-          <w:numId w:val="2"/>
-        </w:numPr>
-        <w:spacing w:after="0" w:line="276" w:lineRule="auto"/>
-        <w:rPr>
-          <w:rFonts w:hint="default" w:ascii="Times New Roman" w:hAnsi="Times New Roman" w:cs="Times New Roman"/>
-          <w:lang w:val="en-US"/>
-        </w:rPr>
-      </w:pPr>
-      <w:r>
-        <w:rPr>
-          <w:rFonts w:hint="default" w:ascii="Times New Roman" w:hAnsi="Times New Roman" w:eastAsia="SimSun" w:cs="Times New Roman"/>
-          <w:sz w:val="24"/>
-          <w:szCs w:val="24"/>
-        </w:rPr>
-        <w:t xml:space="preserve">Apabila jumlah mahasiswa yang dimasukkan adalah 19, berapa kali perulangan WHILE akan berjalan? </w:t>
-      </w:r>
-    </w:p>
-    <w:p>
-      <w:pPr>
-        <w:numPr>
-          <w:numId w:val="0"/>
-        </w:numPr>
-        <w:spacing w:after="0" w:line="276" w:lineRule="auto"/>
-        <w:rPr>
-          <w:rFonts w:hint="default" w:ascii="Times New Roman" w:hAnsi="Times New Roman" w:eastAsia="SimSun" w:cs="Times New Roman"/>
-          <w:sz w:val="24"/>
-          <w:szCs w:val="24"/>
-          <w:lang w:val="en-US"/>
-        </w:rPr>
-      </w:pPr>
-      <w:r>
-        <w:rPr>
-          <w:rFonts w:hint="default" w:ascii="Times New Roman" w:hAnsi="Times New Roman" w:eastAsia="SimSun" w:cs="Times New Roman"/>
-          <w:sz w:val="24"/>
-          <w:szCs w:val="24"/>
-        </w:rPr>
-        <w:t xml:space="preserve"> </w:t>
-      </w:r>
-      <w:r>
-        <w:rPr>
-          <w:rFonts w:hint="default" w:ascii="Times New Roman" w:hAnsi="Times New Roman" w:eastAsia="SimSun" w:cs="Times New Roman"/>
-          <w:sz w:val="24"/>
-          <w:szCs w:val="24"/>
-          <w:lang w:val="en-US"/>
-        </w:rPr>
-        <w:t xml:space="preserve">- maka akan terjadi 19 pengulangan </w:t>
-      </w:r>
-    </w:p>
-    <w:p>
-      <w:pPr>
-        <w:numPr>
-          <w:numId w:val="0"/>
-        </w:numPr>
-        <w:spacing w:after="0" w:line="276" w:lineRule="auto"/>
-        <w:rPr>
-          <w:rFonts w:hint="default" w:ascii="Times New Roman" w:hAnsi="Times New Roman" w:eastAsia="SimSun" w:cs="Times New Roman"/>
-          <w:sz w:val="24"/>
-          <w:szCs w:val="24"/>
-          <w:lang w:val="en-US"/>
-        </w:rPr>
-      </w:pPr>
-    </w:p>
-    <w:p>
-      <w:pPr>
-        <w:numPr>
-          <w:ilvl w:val="0"/>
-          <w:numId w:val="2"/>
-        </w:numPr>
-        <w:spacing w:after="0" w:line="276" w:lineRule="auto"/>
-        <w:rPr>
-          <w:rFonts w:hint="default" w:ascii="Times New Roman" w:hAnsi="Times New Roman" w:cs="Times New Roman"/>
-          <w:lang w:val="en-US"/>
-        </w:rPr>
-      </w:pPr>
-      <w:r>
-        <w:rPr>
-          <w:rFonts w:hint="default" w:ascii="Times New Roman" w:hAnsi="Times New Roman" w:eastAsia="SimSun" w:cs="Times New Roman"/>
-          <w:sz w:val="24"/>
-          <w:szCs w:val="24"/>
-        </w:rPr>
-        <w:t>Modifikasi kode program sehingga apabila terdapat mahasiswa yang mendapat nilai A, program menampilkan pesan tambahan "Bagus, pertahankan nilainya"!</w:t>
-      </w:r>
-    </w:p>
-    <w:p>
-      <w:pPr>
-        <w:numPr>
-          <w:numId w:val="0"/>
-        </w:numPr>
-        <w:spacing w:after="0" w:line="276" w:lineRule="auto"/>
-        <w:rPr>
-          <w:rFonts w:hint="default" w:ascii="Times New Roman" w:hAnsi="Times New Roman" w:cs="Times New Roman"/>
-          <w:lang w:val="en-US"/>
-        </w:rPr>
-      </w:pPr>
-      <w:r>
-        <w:rPr>
-          <w:rFonts w:hint="default" w:ascii="Times New Roman" w:hAnsi="Times New Roman" w:eastAsia="SimSun" w:cs="Times New Roman"/>
-          <w:sz w:val="24"/>
-          <w:szCs w:val="24"/>
-          <w:lang w:val="en-US"/>
-        </w:rPr>
-        <w:t xml:space="preserve">-  </w:t>
-      </w:r>
-    </w:p>
-    <w:p>
-      <w:pPr>
-        <w:pStyle w:val="30"/>
-        <w:numPr>
-          <w:numId w:val="0"/>
-        </w:numPr>
-        <w:spacing w:after="0" w:line="276" w:lineRule="auto"/>
-        <w:contextualSpacing/>
-        <w:rPr>
-          <w:rFonts w:hint="default" w:ascii="Times New Roman" w:hAnsi="Times New Roman" w:cs="Times New Roman"/>
-        </w:rPr>
-      </w:pPr>
     </w:p>
     <w:sectPr>
       <w:headerReference r:id="rId5" w:type="default"/>
@@ -850,7 +1314,7 @@
     <w:sdtPr>
       <w:id w:val="-1548209610"/>
       <w:docPartObj>
-        <w:docPartGallery w:val="AutoText"/>
+        <w:docPartGallery w:val="autotext"/>
       </w:docPartObj>
     </w:sdtPr>
     <w:sdtContent>
@@ -1042,6 +1506,18 @@
 <file path=word/numbering.xml><?xml version="1.0" encoding="utf-8"?>
 <w:numbering xmlns:wpc="http://schemas.microsoft.com/office/word/2010/wordprocessingCanvas" xmlns:mc="http://schemas.openxmlformats.org/markup-compatibility/2006" xmlns:o="urn:schemas-microsoft-com:office:office" xmlns:r="http://schemas.openxmlformats.org/officeDocument/2006/relationships" xmlns:m="http://schemas.openxmlformats.org/officeDocument/2006/math" xmlns:v="urn:schemas-microsoft-com:vml" xmlns:wp14="http://schemas.microsoft.com/office/word/2010/wordprocessingDrawing" xmlns:wp="http://schemas.openxmlformats.org/drawingml/2006/wordprocessingDrawing" xmlns:w10="urn:schemas-microsoft-com:office:word" xmlns:w="http://schemas.openxmlformats.org/wordprocessingml/2006/main" xmlns:w14="http://schemas.microsoft.com/office/word/2010/wordml" xmlns:wpg="http://schemas.microsoft.com/office/word/2010/wordprocessingGroup" xmlns:wpi="http://schemas.microsoft.com/office/word/2010/wordprocessingInk" xmlns:wne="http://schemas.microsoft.com/office/word/2006/wordml" xmlns:wps="http://schemas.microsoft.com/office/word/2010/wordprocessingShape" xmlns:wpsCustomData="http://www.wps.cn/officeDocument/2013/wpsCustomData" mc:Ignorable="w14 wp14">
   <w:abstractNum w:abstractNumId="0">
+    <w:nsid w:val="A5ED3811"/>
+    <w:multiLevelType w:val="singleLevel"/>
+    <w:tmpl w:val="A5ED3811"/>
+    <w:lvl w:ilvl="0" w:tentative="0">
+      <w:start w:val="1"/>
+      <w:numFmt w:val="decimal"/>
+      <w:suff w:val="space"/>
+      <w:lvlText w:val="%1."/>
+      <w:lvlJc w:val="left"/>
+    </w:lvl>
+  </w:abstractNum>
+  <w:abstractNum w:abstractNumId="1">
     <w:nsid w:val="0E21B5C2"/>
     <w:multiLevelType w:val="singleLevel"/>
     <w:tmpl w:val="0E21B5C2"/>
@@ -1053,7 +1529,7 @@
       <w:lvlJc w:val="left"/>
     </w:lvl>
   </w:abstractNum>
-  <w:abstractNum w:abstractNumId="1">
+  <w:abstractNum w:abstractNumId="2">
     <w:nsid w:val="1910D695"/>
     <w:multiLevelType w:val="singleLevel"/>
     <w:tmpl w:val="1910D695"/>
@@ -1065,7 +1541,7 @@
       <w:lvlJc w:val="left"/>
     </w:lvl>
   </w:abstractNum>
-  <w:abstractNum w:abstractNumId="2">
+  <w:abstractNum w:abstractNumId="3">
     <w:nsid w:val="2DB5E0C3"/>
     <w:multiLevelType w:val="singleLevel"/>
     <w:tmpl w:val="2DB5E0C3"/>
@@ -1081,13 +1557,16 @@
     </w:lvl>
   </w:abstractNum>
   <w:num w:numId="1">
+    <w:abstractNumId w:val="2"/>
+  </w:num>
+  <w:num w:numId="2">
     <w:abstractNumId w:val="1"/>
   </w:num>
-  <w:num w:numId="2">
+  <w:num w:numId="3">
+    <w:abstractNumId w:val="3"/>
+  </w:num>
+  <w:num w:numId="4">
     <w:abstractNumId w:val="0"/>
-  </w:num>
-  <w:num w:numId="3">
-    <w:abstractNumId w:val="2"/>
   </w:num>
 </w:numbering>
 </file>
@@ -1134,8 +1613,8 @@
     <w:lsdException w:uiPriority="99" w:name="Normal Indent"/>
     <w:lsdException w:uiPriority="99" w:name="footnote text"/>
     <w:lsdException w:uiPriority="99" w:name="annotation text"/>
-    <w:lsdException w:uiPriority="99" w:semiHidden="0" w:name="header"/>
-    <w:lsdException w:uiPriority="99" w:semiHidden="0" w:name="footer"/>
+    <w:lsdException w:qFormat="1" w:uiPriority="99" w:semiHidden="0" w:name="header"/>
+    <w:lsdException w:qFormat="1" w:uiPriority="99" w:semiHidden="0" w:name="footer"/>
     <w:lsdException w:uiPriority="99" w:name="index heading"/>
     <w:lsdException w:qFormat="1" w:uiPriority="35" w:name="caption"/>
     <w:lsdException w:uiPriority="99" w:name="table of figures"/>
@@ -1588,6 +2067,7 @@
     <w:basedOn w:val="1"/>
     <w:link w:val="36"/>
     <w:unhideWhenUsed/>
+    <w:qFormat/>
     <w:uiPriority w:val="99"/>
     <w:pPr>
       <w:tabs>
@@ -1602,6 +2082,7 @@
     <w:basedOn w:val="1"/>
     <w:link w:val="35"/>
     <w:unhideWhenUsed/>
+    <w:qFormat/>
     <w:uiPriority w:val="99"/>
     <w:pPr>
       <w:tabs>
@@ -1676,6 +2157,7 @@
     <w:basedOn w:val="11"/>
     <w:link w:val="4"/>
     <w:semiHidden/>
+    <w:qFormat/>
     <w:uiPriority w:val="9"/>
     <w:rPr>
       <w:rFonts w:eastAsiaTheme="majorEastAsia" w:cstheme="majorBidi"/>
@@ -1689,6 +2171,7 @@
     <w:basedOn w:val="11"/>
     <w:link w:val="5"/>
     <w:semiHidden/>
+    <w:qFormat/>
     <w:uiPriority w:val="9"/>
     <w:rPr>
       <w:rFonts w:eastAsiaTheme="majorEastAsia" w:cstheme="majorBidi"/>
@@ -1702,6 +2185,7 @@
     <w:basedOn w:val="11"/>
     <w:link w:val="6"/>
     <w:semiHidden/>
+    <w:qFormat/>
     <w:uiPriority w:val="9"/>
     <w:rPr>
       <w:rFonts w:eastAsiaTheme="majorEastAsia" w:cstheme="majorBidi"/>
@@ -1727,6 +2211,7 @@
     <w:basedOn w:val="11"/>
     <w:link w:val="8"/>
     <w:semiHidden/>
+    <w:qFormat/>
     <w:uiPriority w:val="9"/>
     <w:rPr>
       <w:rFonts w:eastAsiaTheme="majorEastAsia" w:cstheme="majorBidi"/>
@@ -1751,6 +2236,7 @@
     <w:basedOn w:val="11"/>
     <w:link w:val="10"/>
     <w:semiHidden/>
+    <w:qFormat/>
     <w:uiPriority w:val="9"/>
     <w:rPr>
       <w:rFonts w:eastAsiaTheme="majorEastAsia" w:cstheme="majorBidi"/>
@@ -1775,6 +2261,7 @@
     <w:name w:val="Subtitle Char"/>
     <w:basedOn w:val="11"/>
     <w:link w:val="15"/>
+    <w:qFormat/>
     <w:uiPriority w:val="11"/>
     <w:rPr>
       <w:rFonts w:eastAsiaTheme="majorEastAsia" w:cstheme="majorBidi"/>
@@ -1892,6 +2379,7 @@
     <w:name w:val="Footer Char"/>
     <w:basedOn w:val="11"/>
     <w:link w:val="13"/>
+    <w:qFormat/>
     <w:uiPriority w:val="99"/>
   </w:style>
 </w:styles>

</xml_diff>